<commit_message>
v445.1.1: Aktenwerkzeuge portabel und Absatzgliederung reproduzierbar
</commit_message>
<xml_diff>
--- a/testakten/anwaltschaft-arbeitsrecht-vertrieb-mainz/26_personalgespraech_kraemer_engel.docx
+++ b/testakten/anwaltschaft-arbeitsrecht-vertrieb-mainz/26_personalgespraech_kraemer_engel.docx
@@ -36,11 +36,21 @@
       <w:pPr>
         <w:pStyle w:val="Heading1"/>
         <w:keepNext/>
-        <w:spacing w:before="240" w:after="240"/>
+        <w:spacing w:before="240" w:after="0"/>
       </w:pPr>
       <w:r>
         <w:t>1 Vertragsmappe und Versand</w:t>
       </w:r>
+    </w:p>
+    <w:p>
+      <w:pPr>
+        <w:keepNext/>
+        <w:spacing w:before="0" w:after="0" w:line="220" w:lineRule="exact"/>
+        <w:rPr>
+          <w:sz w:val="22"/>
+          <w:szCs w:val="22"/>
+        </w:rPr>
+      </w:pPr>
     </w:p>
     <w:p>
       <w:pPr/>
@@ -52,11 +62,21 @@
       <w:pPr>
         <w:pStyle w:val="Heading1"/>
         <w:keepNext/>
-        <w:spacing w:before="240" w:after="240"/>
+        <w:spacing w:before="240" w:after="0"/>
       </w:pPr>
       <w:r>
         <w:t>2 Personalstand und Gespräche</w:t>
       </w:r>
+    </w:p>
+    <w:p>
+      <w:pPr>
+        <w:keepNext/>
+        <w:spacing w:before="0" w:after="0" w:line="220" w:lineRule="exact"/>
+        <w:rPr>
+          <w:sz w:val="22"/>
+          <w:szCs w:val="22"/>
+        </w:rPr>
+      </w:pPr>
     </w:p>
     <w:p>
       <w:pPr/>
@@ -68,11 +88,21 @@
       <w:pPr>
         <w:pStyle w:val="Heading1"/>
         <w:keepNext/>
-        <w:spacing w:before="240" w:after="240"/>
+        <w:spacing w:before="240" w:after="0"/>
       </w:pPr>
       <w:r>
         <w:t>3 Urlaub und Vergütung</w:t>
       </w:r>
+    </w:p>
+    <w:p>
+      <w:pPr>
+        <w:keepNext/>
+        <w:spacing w:before="0" w:after="0" w:line="220" w:lineRule="exact"/>
+        <w:rPr>
+          <w:sz w:val="22"/>
+          <w:szCs w:val="22"/>
+        </w:rPr>
+      </w:pPr>
     </w:p>
     <w:p>
       <w:pPr/>
@@ -84,11 +114,21 @@
       <w:pPr>
         <w:pStyle w:val="Heading1"/>
         <w:keepNext/>
-        <w:spacing w:before="240" w:after="240"/>
+        <w:spacing w:before="240" w:after="0"/>
       </w:pPr>
       <w:r>
         <w:t>4 Geräte und nächste Woche</w:t>
       </w:r>
+    </w:p>
+    <w:p>
+      <w:pPr>
+        <w:keepNext/>
+        <w:spacing w:before="0" w:after="0" w:line="220" w:lineRule="exact"/>
+        <w:rPr>
+          <w:sz w:val="22"/>
+          <w:szCs w:val="22"/>
+        </w:rPr>
+      </w:pPr>
     </w:p>
     <w:p>
       <w:pPr/>
@@ -540,7 +580,7 @@
     <w:pPr>
       <w:keepNext/>
       <w:keepLines/>
-      <w:spacing w:before="480" w:after="240"/>
+      <w:spacing w:before="480" w:after="0"/>
       <w:outlineLvl w:val="0"/>
     </w:pPr>
     <w:rPr>

</xml_diff>

<commit_message>
v445.1.1: Portable Aktenwerkzeuge und reproduzierbare Absatzgliederung
Laufzeiten und Bildschriften portabel auflösen, Voraussetzungen vor der Neuerzeugung prüfen. Echte Leerabsätze in 37 Word-Unterlagen, neue Gesamt-PDFs und Regressionstests. Falltexte unverändert.
</commit_message>
<xml_diff>
--- a/testakten/anwaltschaft-arbeitsrecht-vertrieb-mainz/26_personalgespraech_kraemer_engel.docx
+++ b/testakten/anwaltschaft-arbeitsrecht-vertrieb-mainz/26_personalgespraech_kraemer_engel.docx
@@ -36,11 +36,21 @@
       <w:pPr>
         <w:pStyle w:val="Heading1"/>
         <w:keepNext/>
-        <w:spacing w:before="240" w:after="240"/>
+        <w:spacing w:before="240" w:after="0"/>
       </w:pPr>
       <w:r>
         <w:t>1 Vertragsmappe und Versand</w:t>
       </w:r>
+    </w:p>
+    <w:p>
+      <w:pPr>
+        <w:keepNext/>
+        <w:spacing w:before="0" w:after="0" w:line="220" w:lineRule="exact"/>
+        <w:rPr>
+          <w:sz w:val="22"/>
+          <w:szCs w:val="22"/>
+        </w:rPr>
+      </w:pPr>
     </w:p>
     <w:p>
       <w:pPr/>
@@ -52,11 +62,21 @@
       <w:pPr>
         <w:pStyle w:val="Heading1"/>
         <w:keepNext/>
-        <w:spacing w:before="240" w:after="240"/>
+        <w:spacing w:before="240" w:after="0"/>
       </w:pPr>
       <w:r>
         <w:t>2 Personalstand und Gespräche</w:t>
       </w:r>
+    </w:p>
+    <w:p>
+      <w:pPr>
+        <w:keepNext/>
+        <w:spacing w:before="0" w:after="0" w:line="220" w:lineRule="exact"/>
+        <w:rPr>
+          <w:sz w:val="22"/>
+          <w:szCs w:val="22"/>
+        </w:rPr>
+      </w:pPr>
     </w:p>
     <w:p>
       <w:pPr/>
@@ -68,11 +88,21 @@
       <w:pPr>
         <w:pStyle w:val="Heading1"/>
         <w:keepNext/>
-        <w:spacing w:before="240" w:after="240"/>
+        <w:spacing w:before="240" w:after="0"/>
       </w:pPr>
       <w:r>
         <w:t>3 Urlaub und Vergütung</w:t>
       </w:r>
+    </w:p>
+    <w:p>
+      <w:pPr>
+        <w:keepNext/>
+        <w:spacing w:before="0" w:after="0" w:line="220" w:lineRule="exact"/>
+        <w:rPr>
+          <w:sz w:val="22"/>
+          <w:szCs w:val="22"/>
+        </w:rPr>
+      </w:pPr>
     </w:p>
     <w:p>
       <w:pPr/>
@@ -84,11 +114,21 @@
       <w:pPr>
         <w:pStyle w:val="Heading1"/>
         <w:keepNext/>
-        <w:spacing w:before="240" w:after="240"/>
+        <w:spacing w:before="240" w:after="0"/>
       </w:pPr>
       <w:r>
         <w:t>4 Geräte und nächste Woche</w:t>
       </w:r>
+    </w:p>
+    <w:p>
+      <w:pPr>
+        <w:keepNext/>
+        <w:spacing w:before="0" w:after="0" w:line="220" w:lineRule="exact"/>
+        <w:rPr>
+          <w:sz w:val="22"/>
+          <w:szCs w:val="22"/>
+        </w:rPr>
+      </w:pPr>
     </w:p>
     <w:p>
       <w:pPr/>
@@ -540,7 +580,7 @@
     <w:pPr>
       <w:keepNext/>
       <w:keepLines/>
-      <w:spacing w:before="480" w:after="240"/>
+      <w:spacing w:before="480" w:after="0"/>
       <w:outlineLvl w:val="0"/>
     </w:pPr>
     <w:rPr>

</xml_diff>